<commit_message>
Prendre en charge les styles natifs de notes Word
</commit_message>
<xml_diff>
--- a/tests/fixtures/docx/native-tei-conversion.docx
+++ b/tests/fixtures/docx/native-tei-conversion.docx
@@ -69,7 +69,17 @@
       <w:r>
         <w:br/>
         <w:t>apres retour</w:t>
+      </w:r>
+      <w:r>
+        <w:rPr>
+          <w:rStyle w:val="FootnoteReference"/>
+        </w:rPr>
         <w:footnoteReference w:id="1"/>
+      </w:r>
+      <w:r>
+        <w:rPr>
+          <w:rStyle w:val="EndnoteReference"/>
+        </w:rPr>
         <w:endnoteReference w:id="2"/>
       </w:r>
     </w:p>
@@ -103,6 +113,11 @@
           <w:i/>
         </w:rPr>
         <w:t>Vers deux</w:t>
+      </w:r>
+      <w:r>
+        <w:rPr>
+          <w:rStyle w:val="FootnoteReference"/>
+        </w:rPr>
         <w:footnoteReference w:id="1"/>
       </w:r>
     </w:p>
@@ -165,10 +180,16 @@
   <w:endnote w:id="2">
     <w:p>
       <w:pPr>
-        <w:pStyle w:val="Normal"/>
-      </w:pPr>
-      <w:r>
-        <w:t>Note de fin.</w:t>
+        <w:pStyle w:val="EndnoteText"/>
+      </w:pPr>
+      <w:r>
+        <w:rPr>
+          <w:rStyle w:val="EndnoteReference"/>
+        </w:rPr>
+        <w:endnoteRef/>
+      </w:r>
+      <w:r>
+        <w:t xml:space="preserve">Note de fin.</w:t>
       </w:r>
     </w:p>
   </w:endnote>
@@ -187,10 +208,16 @@
   <w:footnote w:id="1">
     <w:p>
       <w:pPr>
-        <w:pStyle w:val="Normal"/>
-      </w:pPr>
-      <w:r>
-        <w:t>Note de bas de page.</w:t>
+        <w:pStyle w:val="FootnoteText"/>
+      </w:pPr>
+      <w:r>
+        <w:rPr>
+          <w:rStyle w:val="FootnoteReference"/>
+        </w:rPr>
+        <w:footnoteRef/>
+      </w:r>
+      <w:r>
+        <w:t xml:space="preserve">Note de bas de page.</w:t>
       </w:r>
     </w:p>
     <w:p>
@@ -259,6 +286,12 @@
   <w:style w:type="paragraph" w:styleId="IntenseQuote">
     <w:name w:val="Citation intense"/>
   </w:style>
+  <w:style w:type="paragraph" w:styleId="FootnoteText">
+    <w:name w:val="Texte de note de bas de page"/>
+  </w:style>
+  <w:style w:type="paragraph" w:styleId="EndnoteText">
+    <w:name w:val="Texte de note de fin"/>
+  </w:style>
   <w:style w:type="paragraph" w:styleId="UnknownParagraph">
     <w:name w:val="Style local inconnu"/>
     <w:pPr>
@@ -271,6 +304,12 @@
   <w:style w:type="character" w:styleId="Strong">
     <w:name w:val="Fort"/>
   </w:style>
+  <w:style w:type="character" w:styleId="FootnoteReference">
+    <w:name w:val="Appel de note de bas de page"/>
+  </w:style>
+  <w:style w:type="character" w:styleId="EndnoteReference">
+    <w:name w:val="Appel de note de fin"/>
+  </w:style>
   <w:style w:type="character" w:styleId="UnknownCharacter">
     <w:name w:val="Caractere local"/>
   </w:style>

</xml_diff>

<commit_message>
Ajouter les métadonnées JSON et leur éditeur
</commit_message>
<xml_diff>
--- a/tests/fixtures/docx/native-tei-conversion.docx
+++ b/tests/fixtures/docx/native-tei-conversion.docx
@@ -2,6 +2,22 @@
 <file path=word/document.xml><?xml version="1.0" encoding="utf-8"?>
 <w:document xmlns:w="http://schemas.openxmlformats.org/wordprocessingml/2006/main" xmlns:r="http://schemas.openxmlformats.org/officeDocument/2006/relationships">
   <w:body>
+    <w:p>
+      <w:pPr>
+        <w:pStyle w:val="Title"/>
+      </w:pPr>
+      <w:r>
+        <w:t>Une conversion synthetique</w:t>
+      </w:r>
+    </w:p>
+    <w:p>
+      <w:pPr>
+        <w:pStyle w:val="Subtitle"/>
+      </w:pPr>
+      <w:r>
+        <w:t>Metadonnees JSON et TEI</w:t>
+      </w:r>
+    </w:p>
     <w:p>
       <w:pPr>
         <w:pStyle w:val="Normal"/>

</xml_diff>